<commit_message>
practice and research work \reports
</commit_message>
<xml_diff>
--- a/semester2/practice_report2.docx
+++ b/semester2/practice_report2.docx
@@ -535,7 +535,13 @@
         <w:rPr>
           <w:lang w:val="ru-RU"/>
         </w:rPr>
-        <w:t>25</w:t>
+        <w:t>2</w:t>
+      </w:r>
+      <w:r>
+        <w:rPr>
+          <w:lang w:val="ru-RU"/>
+        </w:rPr>
+        <w:t>6</w:t>
       </w:r>
     </w:p>
     <w:p>
@@ -1071,54 +1077,35 @@
         <w:spacing w:line="228" w:lineRule="auto"/>
         <w:rPr>
           <w:rStyle w:val="af1"/>
+          <w:lang w:val="ru-RU"/>
         </w:rPr>
       </w:pPr>
       <w:r>
         <w:rPr>
           <w:rStyle w:val="af1"/>
+          <w:lang w:val="ru-RU"/>
         </w:rPr>
         <w:t>П</w:t>
       </w:r>
-      <w:proofErr w:type="spellStart"/>
       <w:r>
         <w:rPr>
           <w:rStyle w:val="af1"/>
           <w:lang w:val="ru-RU"/>
         </w:rPr>
-        <w:t>одготовка</w:t>
-      </w:r>
-      <w:proofErr w:type="spellEnd"/>
+        <w:t>одготовка данных</w:t>
+      </w:r>
       <w:r>
         <w:rPr>
           <w:rStyle w:val="af1"/>
           <w:lang w:val="ru-RU"/>
         </w:rPr>
-        <w:t xml:space="preserve"> данных</w:t>
-      </w:r>
+        <w:t xml:space="preserve"> и получение </w:t>
+      </w:r>
+      <w:proofErr w:type="spellStart"/>
       <w:r>
         <w:rPr>
           <w:rStyle w:val="af1"/>
-        </w:rPr>
-        <w:t xml:space="preserve"> и </w:t>
-      </w:r>
-      <w:proofErr w:type="spellStart"/>
-      <w:r>
-        <w:rPr>
-          <w:rStyle w:val="af1"/>
-        </w:rPr>
-        <w:t>получение</w:t>
-      </w:r>
-      <w:proofErr w:type="spellEnd"/>
-      <w:r>
-        <w:rPr>
-          <w:rStyle w:val="af1"/>
-        </w:rPr>
-        <w:t xml:space="preserve"> </w:t>
-      </w:r>
-      <w:proofErr w:type="spellStart"/>
-      <w:r>
-        <w:rPr>
-          <w:rStyle w:val="af1"/>
+          <w:lang w:val="ru-RU"/>
         </w:rPr>
         <w:t>датасета</w:t>
       </w:r>
@@ -1182,8 +1169,9 @@
           <w:spacing w:val="0"/>
           <w:lang w:val="ru-RU"/>
         </w:rPr>
-        <w:t xml:space="preserve">. </w:t>
-      </w:r>
+        <w:t xml:space="preserve">. Первичная разметка данных осуществлялась командой с использованием платформы CVAT (Computer Vision </w:t>
+      </w:r>
+      <w:proofErr w:type="spellStart"/>
       <w:r>
         <w:rPr>
           <w:rStyle w:val="af1"/>
@@ -1194,9 +1182,9 @@
           <w:spacing w:val="0"/>
           <w:lang w:val="ru-RU"/>
         </w:rPr>
-        <w:t xml:space="preserve">Первичная разметка данных осуществлялась командой с использованием платформы CVAT (Computer Vision </w:t>
-      </w:r>
-      <w:proofErr w:type="spellStart"/>
+        <w:t>Annotation</w:t>
+      </w:r>
+      <w:proofErr w:type="spellEnd"/>
       <w:r>
         <w:rPr>
           <w:rStyle w:val="af1"/>
@@ -1207,10 +1195,12 @@
           <w:spacing w:val="0"/>
           <w:lang w:val="ru-RU"/>
         </w:rPr>
-        <w:t>Annotation</w:t>
-      </w:r>
-      <w:proofErr w:type="spellEnd"/>
-      <w:r>
+        <w:t xml:space="preserve"> Tool). Моей задачей на данном этапе стала организация конвейера обработки этих данных.</w:t>
+      </w:r>
+    </w:p>
+    <w:p>
+      <w:pPr>
+        <w:spacing w:line="228" w:lineRule="auto"/>
         <w:rPr>
           <w:rStyle w:val="af1"/>
           <w:b w:val="0"/>
@@ -1220,12 +1210,8 @@
           <w:spacing w:val="0"/>
           <w:lang w:val="ru-RU"/>
         </w:rPr>
-        <w:t xml:space="preserve"> Tool). Моей задачей на данном этапе стала организация конвейера обработки этих данных.</w:t>
-      </w:r>
-    </w:p>
-    <w:p>
-      <w:pPr>
-        <w:spacing w:line="228" w:lineRule="auto"/>
+      </w:pPr>
+      <w:r>
         <w:rPr>
           <w:rStyle w:val="af1"/>
           <w:b w:val="0"/>
@@ -1235,7 +1221,8 @@
           <w:spacing w:val="0"/>
           <w:lang w:val="ru-RU"/>
         </w:rPr>
-      </w:pPr>
+        <w:t xml:space="preserve">Мной была произведена выгрузка аннотаций из среды CVAT с последующей программной диагностикой. В ходе диагностики был утвержден финальный перечень классов </w:t>
+      </w:r>
       <w:r>
         <w:rPr>
           <w:rStyle w:val="af1"/>
@@ -1246,7 +1233,7 @@
           <w:spacing w:val="0"/>
           <w:lang w:val="ru-RU"/>
         </w:rPr>
-        <w:t xml:space="preserve">Мной была произведена выгрузка аннотаций из среды CVAT с последующей программной диагностикой. В ходе диагностики был утвержден финальный перечень классов </w:t>
+        <w:t xml:space="preserve">6 конечных </w:t>
       </w:r>
       <w:r>
         <w:rPr>
@@ -1258,7 +1245,7 @@
           <w:spacing w:val="0"/>
           <w:lang w:val="ru-RU"/>
         </w:rPr>
-        <w:t xml:space="preserve">6 конечных </w:t>
+        <w:t>дефектов</w:t>
       </w:r>
       <w:r>
         <w:rPr>
@@ -1270,7 +1257,7 @@
           <w:spacing w:val="0"/>
           <w:lang w:val="ru-RU"/>
         </w:rPr>
-        <w:t>дефектов</w:t>
+        <w:t xml:space="preserve">. </w:t>
       </w:r>
       <w:r>
         <w:rPr>
@@ -1282,8 +1269,9 @@
           <w:spacing w:val="0"/>
           <w:lang w:val="ru-RU"/>
         </w:rPr>
-        <w:t xml:space="preserve">. </w:t>
-      </w:r>
+        <w:t xml:space="preserve">Поскольку разметка проводилась в несколько этапов и сохранялась в виде разрозненных файлов, мной был написан скрипт для слияния этих наборов данных в единый массив. Для обеспечения совместимости с современными фреймворками глубокого обучения, итоговый </w:t>
+      </w:r>
+      <w:proofErr w:type="spellStart"/>
       <w:r>
         <w:rPr>
           <w:rStyle w:val="af1"/>
@@ -1294,9 +1282,9 @@
           <w:spacing w:val="0"/>
           <w:lang w:val="ru-RU"/>
         </w:rPr>
-        <w:t xml:space="preserve">Поскольку разметка проводилась в несколько этапов и сохранялась в виде разрозненных файлов, мной был написан скрипт для слияния этих наборов данных в единый массив. Для обеспечения совместимости с современными фреймворками глубокого обучения, итоговый </w:t>
-      </w:r>
-      <w:proofErr w:type="spellStart"/>
+        <w:t>датасет</w:t>
+      </w:r>
+      <w:proofErr w:type="spellEnd"/>
       <w:r>
         <w:rPr>
           <w:rStyle w:val="af1"/>
@@ -1307,9 +1295,9 @@
           <w:spacing w:val="0"/>
           <w:lang w:val="ru-RU"/>
         </w:rPr>
-        <w:t>датасет</w:t>
-      </w:r>
-      <w:proofErr w:type="spellEnd"/>
+        <w:t xml:space="preserve"> был конвертирован в общепринятый стандарт формата COCO, который оптимально подходит для задач инстанс-</w:t>
+      </w:r>
+      <w:proofErr w:type="gramStart"/>
       <w:r>
         <w:rPr>
           <w:rStyle w:val="af1"/>
@@ -1320,9 +1308,9 @@
           <w:spacing w:val="0"/>
           <w:lang w:val="ru-RU"/>
         </w:rPr>
-        <w:t xml:space="preserve"> был конвертирован в общепринятый стандарт формата COCO, который оптимально подходит для задач инстанс-</w:t>
-      </w:r>
-      <w:proofErr w:type="gramStart"/>
+        <w:t>сегментации ,</w:t>
+      </w:r>
+      <w:proofErr w:type="gramEnd"/>
       <w:r>
         <w:rPr>
           <w:rStyle w:val="af1"/>
@@ -1333,10 +1321,37 @@
           <w:spacing w:val="0"/>
           <w:lang w:val="ru-RU"/>
         </w:rPr>
-        <w:t>сегментации ,</w:t>
-      </w:r>
-      <w:proofErr w:type="gramEnd"/>
-      <w:r>
+        <w:t xml:space="preserve"> так как хранит точные координаты полигонов для каждого объекта.</w:t>
+      </w:r>
+    </w:p>
+    <w:p>
+      <w:pPr>
+        <w:spacing w:line="228" w:lineRule="auto"/>
+        <w:rPr>
+          <w:rStyle w:val="af1"/>
+          <w:lang w:val="ru-RU"/>
+        </w:rPr>
+      </w:pPr>
+      <w:r>
+        <w:rPr>
+          <w:rStyle w:val="af1"/>
+          <w:lang w:val="ru-RU"/>
+        </w:rPr>
+        <w:t xml:space="preserve">Настройка среды и обучение модели </w:t>
+      </w:r>
+      <w:proofErr w:type="spellStart"/>
+      <w:r>
+        <w:rPr>
+          <w:rStyle w:val="af1"/>
+          <w:lang w:val="ru-RU"/>
+        </w:rPr>
+        <w:t>RTMDet-Ins</w:t>
+      </w:r>
+      <w:proofErr w:type="spellEnd"/>
+    </w:p>
+    <w:p>
+      <w:pPr>
+        <w:pStyle w:val="a9"/>
         <w:rPr>
           <w:rStyle w:val="af1"/>
           <w:b w:val="0"/>
@@ -1344,46 +1359,6 @@
           <w:smallCaps w:val="0"/>
           <w:color w:val="auto"/>
           <w:spacing w:val="0"/>
-          <w:lang w:val="ru-RU"/>
-        </w:rPr>
-        <w:t xml:space="preserve"> так как хранит точные координаты полигонов для каждого объекта.</w:t>
-      </w:r>
-    </w:p>
-    <w:p>
-      <w:pPr>
-        <w:spacing w:line="228" w:lineRule="auto"/>
-        <w:rPr>
-          <w:rStyle w:val="af1"/>
-          <w:lang w:val="ru-RU"/>
-        </w:rPr>
-      </w:pPr>
-      <w:r>
-        <w:rPr>
-          <w:rStyle w:val="af1"/>
-          <w:lang w:val="ru-RU"/>
-        </w:rPr>
-        <w:t xml:space="preserve">Настройка среды и обучение модели </w:t>
-      </w:r>
-      <w:proofErr w:type="spellStart"/>
-      <w:r>
-        <w:rPr>
-          <w:rStyle w:val="af1"/>
-          <w:lang w:val="ru-RU"/>
-        </w:rPr>
-        <w:t>RTMDet-Ins</w:t>
-      </w:r>
-      <w:proofErr w:type="spellEnd"/>
-    </w:p>
-    <w:p>
-      <w:pPr>
-        <w:pStyle w:val="a9"/>
-        <w:rPr>
-          <w:rStyle w:val="af1"/>
-          <w:b w:val="0"/>
-          <w:bCs w:val="0"/>
-          <w:smallCaps w:val="0"/>
-          <w:color w:val="auto"/>
-          <w:spacing w:val="0"/>
         </w:rPr>
       </w:pPr>
       <w:r>
@@ -1716,13 +1691,7 @@
       </w:r>
       <w:proofErr w:type="spellEnd"/>
       <w:r>
-        <w:t xml:space="preserve"> сохраняет веса в собственном формате, который тяжеловесен и не всегда удобен для интеграции в окружени</w:t>
-      </w:r>
-      <w:r>
-        <w:t>е</w:t>
-      </w:r>
-      <w:r>
-        <w:t>.</w:t>
+        <w:t xml:space="preserve"> сохраняет веса в собственном формате, который тяжеловесен и не всегда удобен для интеграции в окружение.</w:t>
       </w:r>
     </w:p>
     <w:p>
@@ -1798,11 +1767,12 @@
           <w:lang w:val="ru-RU"/>
         </w:rPr>
       </w:pPr>
-      <w:proofErr w:type="spellStart"/>
-      <w:r>
+      <w:r>
+        <w:rPr>
+          <w:lang w:val="ru-RU"/>
+        </w:rPr>
         <w:t>Выводы</w:t>
       </w:r>
-      <w:proofErr w:type="spellEnd"/>
     </w:p>
     <w:p>
       <w:pPr>
@@ -2079,13 +2049,7 @@
         <w:rPr>
           <w:lang w:val="en-US"/>
         </w:rPr>
-        <w:t>. 740-755</w:t>
-      </w:r>
-      <w:r>
-        <w:rPr>
-          <w:lang w:val="en-US"/>
-        </w:rPr>
-        <w:t>.</w:t>
+        <w:t>. 740-755.</w:t>
       </w:r>
     </w:p>
     <w:p>
@@ -2994,21 +2958,7 @@
             <w:rStyle w:val="ad"/>
             <w:lang w:val="ru-RU"/>
           </w:rPr>
-          <w:t>Глава Карелии вруч</w:t>
-        </w:r>
-        <w:r>
-          <w:rPr>
-            <w:rStyle w:val="ad"/>
-            <w:lang w:val="ru-RU"/>
-          </w:rPr>
-          <w:t>и</w:t>
-        </w:r>
-        <w:r>
-          <w:rPr>
-            <w:rStyle w:val="ad"/>
-            <w:lang w:val="ru-RU"/>
-          </w:rPr>
-          <w:t>л дипломы победителям конкурса грантов</w:t>
+          <w:t>Глава Карелии вручил дипломы победителям конкурса грантов</w:t>
         </w:r>
       </w:hyperlink>
     </w:p>
@@ -3017,6 +2967,8 @@
       <w:pgSz w:w="11905" w:h="16837"/>
       <w:pgMar w:top="1440" w:right="1132" w:bottom="1440" w:left="1440" w:header="720" w:footer="720" w:gutter="0"/>
       <w:cols w:space="720"/>
+      <w:titlePg/>
+      <w:docGrid w:linePitch="326"/>
     </w:sectPr>
   </w:body>
 </w:document>
@@ -4491,6 +4443,62 @@
       <w:spacing w:val="5"/>
     </w:rPr>
   </w:style>
+  <w:style w:type="paragraph" w:styleId="af2">
+    <w:name w:val="header"/>
+    <w:basedOn w:val="a"/>
+    <w:link w:val="af3"/>
+    <w:uiPriority w:val="99"/>
+    <w:unhideWhenUsed/>
+    <w:rsid w:val="00F07CB7"/>
+    <w:pPr>
+      <w:tabs>
+        <w:tab w:val="center" w:pos="4677"/>
+        <w:tab w:val="right" w:pos="9355"/>
+      </w:tabs>
+      <w:spacing w:after="0" w:line="240" w:lineRule="auto"/>
+    </w:pPr>
+  </w:style>
+  <w:style w:type="character" w:customStyle="1" w:styleId="af3">
+    <w:name w:val="Верхний колонтитул Знак"/>
+    <w:basedOn w:val="a0"/>
+    <w:link w:val="af2"/>
+    <w:uiPriority w:val="99"/>
+    <w:rsid w:val="00F07CB7"/>
+    <w:rPr>
+      <w:rFonts w:ascii="Times New Roman" w:eastAsia="Times New Roman" w:hAnsi="Times New Roman" w:cs="Times New Roman"/>
+      <w:sz w:val="24"/>
+      <w:szCs w:val="24"/>
+      <w:lang w:val="en-US" w:eastAsia="ru-RU"/>
+    </w:rPr>
+  </w:style>
+  <w:style w:type="paragraph" w:styleId="af4">
+    <w:name w:val="footer"/>
+    <w:basedOn w:val="a"/>
+    <w:link w:val="af5"/>
+    <w:uiPriority w:val="99"/>
+    <w:unhideWhenUsed/>
+    <w:rsid w:val="00F07CB7"/>
+    <w:pPr>
+      <w:tabs>
+        <w:tab w:val="center" w:pos="4677"/>
+        <w:tab w:val="right" w:pos="9355"/>
+      </w:tabs>
+      <w:spacing w:after="0" w:line="240" w:lineRule="auto"/>
+    </w:pPr>
+  </w:style>
+  <w:style w:type="character" w:customStyle="1" w:styleId="af5">
+    <w:name w:val="Нижний колонтитул Знак"/>
+    <w:basedOn w:val="a0"/>
+    <w:link w:val="af4"/>
+    <w:uiPriority w:val="99"/>
+    <w:rsid w:val="00F07CB7"/>
+    <w:rPr>
+      <w:rFonts w:ascii="Times New Roman" w:eastAsia="Times New Roman" w:hAnsi="Times New Roman" w:cs="Times New Roman"/>
+      <w:sz w:val="24"/>
+      <w:szCs w:val="24"/>
+      <w:lang w:val="en-US" w:eastAsia="ru-RU"/>
+    </w:rPr>
+  </w:style>
 </w:styles>
 </file>
 

</xml_diff>